<commit_message>
CFET flow: Word manuscript builder fixes (headings, tables, math)
Co-Authored-By: Claude Fable 5.1 <noreply@anthropic.com>
Claude-Session: https://claude.ai/code/session_01W6ePgRSGyE3WD8PKAKFUvX
</commit_message>
<xml_diff>
--- a/cfet_multimaterial/paper/manuscript.docx
+++ b/cfet_multimaterial/paper/manuscript.docx
@@ -509,31 +509,7 @@
           <w:sz w:val="18"/>
           <w:szCs w:val="18"/>
         </w:rPr>
-        <w:t xml:space="preserve">5\</w:t>
-      </w:r>
-      <w:r>
-        <w:rPr>
-          <w:rFonts w:ascii="Times New Roman" w:cs="Times New Roman" w:eastAsia="Times New Roman" w:hAnsi="Times New Roman"/>
-          <w:b/>
-          <w:bCs/>
-          <w:i/>
-          <w:iCs/>
-          <w:sz w:val="18"/>
-          <w:szCs w:val="18"/>
-        </w:rPr>
-        <w:t xml:space="preserve">times</w:t>
-      </w:r>
-      <w:r>
-        <w:rPr>
-          <w:rFonts w:ascii="Times New Roman" w:cs="Times New Roman" w:eastAsia="Times New Roman" w:hAnsi="Times New Roman"/>
-          <w:b/>
-          <w:bCs/>
-          <w:i w:val="false"/>
-          <w:iCs w:val="false"/>
-          <w:sz w:val="18"/>
-          <w:szCs w:val="18"/>
-        </w:rPr>
-        <w:t xml:space="preserve">10</w:t>
+        <w:t xml:space="preserve">5×10</w:t>
       </w:r>
       <w:r>
         <w:rPr>
@@ -864,8 +840,7 @@
                 <w:sz w:val="14"/>
                 <w:szCs w:val="14"/>
               </w:rPr>
-              <w:t xml:space="preserve">lllp{2.6cm}c@{}}
-ID</w:t>
+              <w:t xml:space="preserve">ID</w:t>
             </w:r>
           </w:p>
         </w:tc>
@@ -2917,19 +2892,7 @@
           <w:sz w:val="20"/>
           <w:szCs w:val="20"/>
         </w:rPr>
-        <w:t xml:space="preserve"> - η\</w:t>
-      </w:r>
-      <w:r>
-        <w:rPr>
-          <w:rFonts w:ascii="Times New Roman" w:cs="Times New Roman" w:eastAsia="Times New Roman" w:hAnsi="Times New Roman"/>
-          <w:b w:val="false"/>
-          <w:bCs w:val="false"/>
-          <w:i/>
-          <w:iCs/>
-          <w:sz w:val="20"/>
-          <w:szCs w:val="20"/>
-        </w:rPr>
-        <w:t xml:space="preserve">sqrt</w:t>
+        <w:t xml:space="preserve"> - η√(</w:t>
       </w:r>
       <w:r>
         <w:rPr>
@@ -3004,6 +2967,18 @@
           <w:sz w:val="20"/>
           <w:szCs w:val="20"/>
         </w:rPr>
+        <w:t xml:space="preserve">)</w:t>
+      </w:r>
+      <w:r>
+        <w:rPr>
+          <w:rFonts w:ascii="Times New Roman" w:cs="Times New Roman" w:eastAsia="Times New Roman" w:hAnsi="Times New Roman"/>
+          <w:b w:val="false"/>
+          <w:bCs w:val="false"/>
+          <w:i w:val="false"/>
+          <w:iCs w:val="false"/>
+          <w:sz w:val="20"/>
+          <w:szCs w:val="20"/>
+        </w:rPr>
         <w:t xml:space="preserve"> and the temperature dependence as </w:t>
       </w:r>
       <w:r>
@@ -3213,19 +3188,7 @@
           <w:sz w:val="20"/>
           <w:szCs w:val="20"/>
         </w:rPr>
-        <w:t xml:space="preserve">\</w:t>
-      </w:r>
-      <w:r>
-        <w:rPr>
-          <w:rFonts w:ascii="Times New Roman" w:cs="Times New Roman" w:eastAsia="Times New Roman" w:hAnsi="Times New Roman"/>
-          <w:b w:val="false"/>
-          <w:bCs w:val="false"/>
-          <w:i/>
-          <w:iCs/>
-          <w:sz w:val="20"/>
-          <w:szCs w:val="20"/>
-        </w:rPr>
-        <w:t xml:space="preserve">mu</w:t>
+        <w:t xml:space="preserve">µ</w:t>
       </w:r>
       <w:r>
         <w:rPr>
@@ -3250,19 +3213,7 @@
           <w:sz w:val="20"/>
           <w:szCs w:val="20"/>
         </w:rPr>
-        <w:t xml:space="preserve">=\</w:t>
-      </w:r>
-      <w:r>
-        <w:rPr>
-          <w:rFonts w:ascii="Times New Roman" w:cs="Times New Roman" w:eastAsia="Times New Roman" w:hAnsi="Times New Roman"/>
-          <w:b w:val="false"/>
-          <w:bCs w:val="false"/>
-          <w:i/>
-          <w:iCs/>
-          <w:sz w:val="20"/>
-          <w:szCs w:val="20"/>
-        </w:rPr>
-        <w:t xml:space="preserve">mu</w:t>
+        <w:t xml:space="preserve">=µ</w:t>
       </w:r>
       <w:r>
         <w:rPr>
@@ -3473,19 +3424,7 @@
           <w:sz w:val="20"/>
           <w:szCs w:val="20"/>
         </w:rPr>
-        <w:t xml:space="preserve">β=\</w:t>
-      </w:r>
-      <w:r>
-        <w:rPr>
-          <w:rFonts w:ascii="Times New Roman" w:cs="Times New Roman" w:eastAsia="Times New Roman" w:hAnsi="Times New Roman"/>
-          <w:b w:val="false"/>
-          <w:bCs w:val="false"/>
-          <w:i/>
-          <w:iCs/>
-          <w:sz w:val="20"/>
-          <w:szCs w:val="20"/>
-        </w:rPr>
-        <w:t xml:space="preserve">mu</w:t>
+        <w:t xml:space="preserve">β=µ</w:t>
       </w:r>
       <w:r>
         <w:rPr>
@@ -3669,19 +3608,7 @@
           <w:sz w:val="20"/>
           <w:szCs w:val="20"/>
         </w:rPr>
-        <w:t xml:space="preserve">/\</w:t>
-      </w:r>
-      <w:r>
-        <w:rPr>
-          <w:rFonts w:ascii="Times New Roman" w:cs="Times New Roman" w:eastAsia="Times New Roman" w:hAnsi="Times New Roman"/>
-          <w:b w:val="false"/>
-          <w:bCs w:val="false"/>
-          <w:i/>
-          <w:iCs/>
-          <w:sz w:val="20"/>
-          <w:szCs w:val="20"/>
-        </w:rPr>
-        <w:t xml:space="preserve">mu</w:t>
+        <w:t xml:space="preserve">/µ</w:t>
       </w:r>
       <w:r>
         <w:rPr>
@@ -4504,19 +4431,7 @@
           <w:sz w:val="20"/>
           <w:szCs w:val="20"/>
         </w:rPr>
-        <w:t xml:space="preserve">d</w:t>
-      </w:r>
-      <w:r>
-        <w:rPr>
-          <w:rFonts w:ascii="Times New Roman" w:cs="Times New Roman" w:eastAsia="Times New Roman" w:hAnsi="Times New Roman"/>
-          <w:b w:val="false"/>
-          <w:bCs w:val="false"/>
-          <w:i/>
-          <w:iCs/>
-          <w:sz w:val="20"/>
-          <w:szCs w:val="20"/>
-        </w:rPr>
-        <w:t xml:space="preserve">Q</w:t>
+        <w:t xml:space="preserve">dQ</w:t>
       </w:r>
       <w:r>
         <w:rPr>
@@ -4540,19 +4455,7 @@
           <w:sz w:val="20"/>
           <w:szCs w:val="20"/>
         </w:rPr>
-        <w:t xml:space="preserve">d</w:t>
-      </w:r>
-      <w:r>
-        <w:rPr>
-          <w:rFonts w:ascii="Times New Roman" w:cs="Times New Roman" w:eastAsia="Times New Roman" w:hAnsi="Times New Roman"/>
-          <w:b w:val="false"/>
-          <w:bCs w:val="false"/>
-          <w:i/>
-          <w:iCs/>
-          <w:sz w:val="20"/>
-          <w:szCs w:val="20"/>
-        </w:rPr>
-        <w:t xml:space="preserve">t</w:t>
+        <w:t xml:space="preserve">dt</w:t>
       </w:r>
       <w:r>
         <w:rPr>
@@ -5903,19 +5806,7 @@
           <w:sz w:val="20"/>
           <w:szCs w:val="20"/>
         </w:rPr>
-        <w:t xml:space="preserve">\</w:t>
-      </w:r>
-      <w:r>
-        <w:rPr>
-          <w:rFonts w:ascii="Times New Roman" w:cs="Times New Roman" w:eastAsia="Times New Roman" w:hAnsi="Times New Roman"/>
-          <w:b w:val="false"/>
-          <w:bCs w:val="false"/>
-          <w:i/>
-          <w:iCs/>
-          <w:sz w:val="20"/>
-          <w:szCs w:val="20"/>
-        </w:rPr>
-        <w:t xml:space="preserve">eta</w:t>
+        <w:t xml:space="preserve">η</w:t>
       </w:r>
       <w:r>
         <w:rPr>
@@ -6714,19 +6605,7 @@
           <w:sz w:val="20"/>
           <w:szCs w:val="20"/>
         </w:rPr>
-        <w:t xml:space="preserve">d</w:t>
-      </w:r>
-      <w:r>
-        <w:rPr>
-          <w:rFonts w:ascii="Times New Roman" w:cs="Times New Roman" w:eastAsia="Times New Roman" w:hAnsi="Times New Roman"/>
-          <w:b w:val="false"/>
-          <w:bCs w:val="false"/>
-          <w:i/>
-          <w:iCs/>
-          <w:sz w:val="20"/>
-          <w:szCs w:val="20"/>
-        </w:rPr>
-        <w:t xml:space="preserve">V</w:t>
+        <w:t xml:space="preserve">dV</w:t>
       </w:r>
       <w:r>
         <w:rPr>
@@ -6787,19 +6666,7 @@
           <w:sz w:val="20"/>
           <w:szCs w:val="20"/>
         </w:rPr>
-        <w:t xml:space="preserve">d</w:t>
-      </w:r>
-      <w:r>
-        <w:rPr>
-          <w:rFonts w:ascii="Times New Roman" w:cs="Times New Roman" w:eastAsia="Times New Roman" w:hAnsi="Times New Roman"/>
-          <w:b w:val="false"/>
-          <w:bCs w:val="false"/>
-          <w:i/>
-          <w:iCs/>
-          <w:sz w:val="20"/>
-          <w:szCs w:val="20"/>
-        </w:rPr>
-        <w:t xml:space="preserve">t</w:t>
+        <w:t xml:space="preserve">dt</w:t>
       </w:r>
       <w:r>
         <w:rPr>
@@ -7566,19 +7433,7 @@
           <w:sz w:val="20"/>
           <w:szCs w:val="20"/>
         </w:rPr>
-        <w:t xml:space="preserve">\</w:t>
-      </w:r>
-      <w:r>
-        <w:rPr>
-          <w:rFonts w:ascii="Times New Roman" w:cs="Times New Roman" w:eastAsia="Times New Roman" w:hAnsi="Times New Roman"/>
-          <w:b w:val="false"/>
-          <w:bCs w:val="false"/>
-          <w:i/>
-          <w:iCs/>
-          <w:sz w:val="20"/>
-          <w:szCs w:val="20"/>
-        </w:rPr>
-        <w:t xml:space="preserve">eta</w:t>
+        <w:t xml:space="preserve">η</w:t>
       </w:r>
       <w:r>
         <w:rPr>
@@ -8303,19 +8158,7 @@
           <w:sz w:val="16"/>
           <w:szCs w:val="16"/>
         </w:rPr>
-        <w:t xml:space="preserve">d</w:t>
-      </w:r>
-      <w:r>
-        <w:rPr>
-          <w:rFonts w:ascii="Times New Roman" w:cs="Times New Roman" w:eastAsia="Times New Roman" w:hAnsi="Times New Roman"/>
-          <w:b w:val="false"/>
-          <w:bCs w:val="false"/>
-          <w:i/>
-          <w:iCs/>
-          <w:sz w:val="16"/>
-          <w:szCs w:val="16"/>
-        </w:rPr>
-        <w:t xml:space="preserve">Q</w:t>
+        <w:t xml:space="preserve">dQ</w:t>
       </w:r>
       <w:r>
         <w:rPr>
@@ -8352,19 +8195,7 @@
           <w:sz w:val="16"/>
           <w:szCs w:val="16"/>
         </w:rPr>
-        <w:t xml:space="preserve">d</w:t>
-      </w:r>
-      <w:r>
-        <w:rPr>
-          <w:rFonts w:ascii="Times New Roman" w:cs="Times New Roman" w:eastAsia="Times New Roman" w:hAnsi="Times New Roman"/>
-          <w:b w:val="false"/>
-          <w:bCs w:val="false"/>
-          <w:i/>
-          <w:iCs/>
-          <w:sz w:val="16"/>
-          <w:szCs w:val="16"/>
-        </w:rPr>
-        <w:t xml:space="preserve">V</w:t>
+        <w:t xml:space="preserve">dV</w:t>
       </w:r>
       <w:r>
         <w:rPr>
@@ -8659,18 +8490,6 @@
           <w:sz w:val="20"/>
           <w:szCs w:val="20"/>
         </w:rPr>
-        <w:t xml:space="preserve">\</w:t>
-      </w:r>
-      <w:r>
-        <w:rPr>
-          <w:rFonts w:ascii="Times New Roman" w:cs="Times New Roman" w:eastAsia="Times New Roman" w:hAnsi="Times New Roman"/>
-          <w:b w:val="false"/>
-          <w:bCs w:val="false"/>
-          <w:i w:val="false"/>
-          <w:iCs w:val="false"/>
-          <w:sz w:val="20"/>
-          <w:szCs w:val="20"/>
-        </w:rPr>
         <w:t xml:space="preserve">log</w:t>
       </w:r>
       <w:r>
@@ -8918,19 +8737,7 @@
           <w:sz w:val="20"/>
           <w:szCs w:val="20"/>
         </w:rPr>
-        <w:t xml:space="preserve">\</w:t>
-      </w:r>
-      <w:r>
-        <w:rPr>
-          <w:rFonts w:ascii="Times New Roman" w:cs="Times New Roman" w:eastAsia="Times New Roman" w:hAnsi="Times New Roman"/>
-          <w:b w:val="false"/>
-          <w:bCs w:val="false"/>
-          <w:i/>
-          <w:iCs/>
-          <w:sz w:val="20"/>
-          <w:szCs w:val="20"/>
-        </w:rPr>
-        <w:t xml:space="preserve">mu</w:t>
+        <w:t xml:space="preserve">µ</w:t>
       </w:r>
       <w:r>
         <w:rPr>
@@ -11558,19 +11365,7 @@
                 <w:sz w:val="14"/>
                 <w:szCs w:val="14"/>
               </w:rPr>
-              <w:t xml:space="preserve">\</w:t>
-            </w:r>
-            <w:r>
-              <w:rPr>
-                <w:rFonts w:ascii="Times New Roman" w:cs="Times New Roman" w:eastAsia="Times New Roman" w:hAnsi="Times New Roman"/>
-                <w:b w:val="false"/>
-                <w:bCs w:val="false"/>
-                <w:i/>
-                <w:iCs/>
-                <w:sz w:val="14"/>
-                <w:szCs w:val="14"/>
-              </w:rPr>
-              <w:t xml:space="preserve">mu</w:t>
+              <w:t xml:space="preserve">µ</w:t>
             </w:r>
             <w:r>
               <w:rPr>
@@ -19875,7 +19670,7 @@
           <w:sz w:val="20"/>
           <w:szCs w:val="20"/>
         </w:rPr>
-        <w:t xml:space="preserve">E. </w:t>
+        <w:t xml:space="preserve">A. </w:t>
       </w:r>
       <w:r>
         <w:rPr>
@@ -20446,31 +20241,7 @@
           <w:sz w:val="20"/>
           <w:szCs w:val="20"/>
         </w:rPr>
-        <w:t xml:space="preserve">\</w:t>
-      </w:r>
-      <w:r>
-        <w:rPr>
-          <w:rFonts w:ascii="Times New Roman" w:cs="Times New Roman" w:eastAsia="Times New Roman" w:hAnsi="Times New Roman"/>
-          <w:b w:val="false"/>
-          <w:bCs w:val="false"/>
-          <w:i/>
-          <w:iCs/>
-          <w:sz w:val="20"/>
-          <w:szCs w:val="20"/>
-        </w:rPr>
-        <w:t xml:space="preserve">int</w:t>
-      </w:r>
-      <w:r>
-        <w:rPr>
-          <w:rFonts w:ascii="Times New Roman" w:cs="Times New Roman" w:eastAsia="Times New Roman" w:hAnsi="Times New Roman"/>
-          <w:b w:val="false"/>
-          <w:bCs w:val="false"/>
-          <w:i w:val="false"/>
-          <w:iCs w:val="false"/>
-          <w:sz w:val="20"/>
-          <w:szCs w:val="20"/>
-        </w:rPr>
-        <w:t xml:space="preserve"> </w:t>
+        <w:t xml:space="preserve">∫ </w:t>
       </w:r>
       <w:r>
         <w:rPr>
@@ -20532,19 +20303,7 @@
           <w:sz w:val="20"/>
           <w:szCs w:val="20"/>
         </w:rPr>
-        <w:t xml:space="preserve">d</w:t>
-      </w:r>
-      <w:r>
-        <w:rPr>
-          <w:rFonts w:ascii="Times New Roman" w:cs="Times New Roman" w:eastAsia="Times New Roman" w:hAnsi="Times New Roman"/>
-          <w:b w:val="false"/>
-          <w:bCs w:val="false"/>
-          <w:i/>
-          <w:iCs/>
-          <w:sz w:val="20"/>
-          <w:szCs w:val="20"/>
-        </w:rPr>
-        <w:t xml:space="preserve">t</w:t>
+        <w:t xml:space="preserve">dt</w:t>
       </w:r>
       <w:r>
         <w:rPr>
@@ -20597,7 +20356,7 @@
           <w:sz w:val="20"/>
           <w:szCs w:val="20"/>
         </w:rPr>
-        <w:t xml:space="preserve">F. </w:t>
+        <w:t xml:space="preserve">B. </w:t>
       </w:r>
       <w:r>
         <w:rPr>
@@ -21128,29 +20887,67 @@
           <w:sz w:val="20"/>
           <w:szCs w:val="20"/>
         </w:rPr>
-        <w:t xml:space="preserve">=\</w:t>
-      </w:r>
-      <w:r>
-        <w:rPr>
-          <w:rFonts w:ascii="Times New Roman" w:cs="Times New Roman" w:eastAsia="Times New Roman" w:hAnsi="Times New Roman"/>
-          <w:b w:val="false"/>
-          <w:bCs w:val="false"/>
-          <w:i/>
-          <w:iCs/>
-          <w:sz w:val="20"/>
-          <w:szCs w:val="20"/>
-        </w:rPr>
-        <w:t xml:space="preserve">frac</w:t>
-      </w:r>
-      <w:r>
-        <w:rPr>
-          <w:rFonts w:ascii="Times New Roman" w:cs="Times New Roman" w:eastAsia="Times New Roman" w:hAnsi="Times New Roman"/>
-          <w:b w:val="false"/>
-          <w:bCs w:val="false"/>
-          <w:i w:val="false"/>
-          <w:iCs w:val="false"/>
-          <w:sz w:val="20"/>
-          <w:szCs w:val="20"/>
+        <w:t xml:space="preserve">=(1)/(</w:t>
+      </w:r>
+      <w:r>
+        <w:rPr>
+          <w:rFonts w:ascii="Times New Roman" w:cs="Times New Roman" w:eastAsia="Times New Roman" w:hAnsi="Times New Roman"/>
+          <w:b w:val="false"/>
+          <w:bCs w:val="false"/>
+          <w:i/>
+          <w:iCs/>
+          <w:sz w:val="20"/>
+          <w:szCs w:val="20"/>
+        </w:rPr>
+        <w:t xml:space="preserve">t</w:t>
+      </w:r>
+      <w:r>
+        <w:rPr>
+          <w:rFonts w:ascii="Times New Roman" w:cs="Times New Roman" w:eastAsia="Times New Roman" w:hAnsi="Times New Roman"/>
+          <w:b w:val="false"/>
+          <w:bCs w:val="false"/>
+          <w:i w:val="false"/>
+          <w:iCs w:val="false"/>
+          <w:sz w:val="20"/>
+          <w:szCs w:val="20"/>
+          <w:vertAlign w:val="subscript"/>
+        </w:rPr>
+        <w:t xml:space="preserve">2</w:t>
+      </w:r>
+      <w:r>
+        <w:rPr>
+          <w:rFonts w:ascii="Times New Roman" w:cs="Times New Roman" w:eastAsia="Times New Roman" w:hAnsi="Times New Roman"/>
+          <w:b w:val="false"/>
+          <w:bCs w:val="false"/>
+          <w:i w:val="false"/>
+          <w:iCs w:val="false"/>
+          <w:sz w:val="20"/>
+          <w:szCs w:val="20"/>
+        </w:rPr>
+        <w:t xml:space="preserve">-</w:t>
+      </w:r>
+      <w:r>
+        <w:rPr>
+          <w:rFonts w:ascii="Times New Roman" w:cs="Times New Roman" w:eastAsia="Times New Roman" w:hAnsi="Times New Roman"/>
+          <w:b w:val="false"/>
+          <w:bCs w:val="false"/>
+          <w:i/>
+          <w:iCs/>
+          <w:sz w:val="20"/>
+          <w:szCs w:val="20"/>
+        </w:rPr>
+        <w:t xml:space="preserve">t</w:t>
+      </w:r>
+      <w:r>
+        <w:rPr>
+          <w:rFonts w:ascii="Times New Roman" w:cs="Times New Roman" w:eastAsia="Times New Roman" w:hAnsi="Times New Roman"/>
+          <w:b w:val="false"/>
+          <w:bCs w:val="false"/>
+          <w:i w:val="false"/>
+          <w:iCs w:val="false"/>
+          <w:sz w:val="20"/>
+          <w:szCs w:val="20"/>
+          <w:vertAlign w:val="subscript"/>
         </w:rPr>
         <w:t xml:space="preserve">1</w:t>
       </w:r>
@@ -21159,86 +20956,75 @@
           <w:rFonts w:ascii="Times New Roman" w:cs="Times New Roman" w:eastAsia="Times New Roman" w:hAnsi="Times New Roman"/>
           <w:b w:val="false"/>
           <w:bCs w:val="false"/>
-          <w:i/>
-          <w:iCs/>
-          <w:sz w:val="20"/>
-          <w:szCs w:val="20"/>
-        </w:rPr>
-        <w:t xml:space="preserve">t</w:t>
-      </w:r>
-      <w:r>
-        <w:rPr>
-          <w:rFonts w:ascii="Times New Roman" w:cs="Times New Roman" w:eastAsia="Times New Roman" w:hAnsi="Times New Roman"/>
-          <w:b w:val="false"/>
-          <w:bCs w:val="false"/>
-          <w:i w:val="false"/>
-          <w:iCs w:val="false"/>
+          <w:i w:val="false"/>
+          <w:iCs w:val="false"/>
+          <w:sz w:val="20"/>
+          <w:szCs w:val="20"/>
+        </w:rPr>
+        <w:t xml:space="preserve">)∫</w:t>
+      </w:r>
+      <w:r>
+        <w:rPr>
+          <w:rFonts w:ascii="Times New Roman" w:cs="Times New Roman" w:eastAsia="Times New Roman" w:hAnsi="Times New Roman"/>
+          <w:b w:val="false"/>
+          <w:bCs w:val="false"/>
+          <w:i/>
+          <w:iCs/>
           <w:sz w:val="20"/>
           <w:szCs w:val="20"/>
           <w:vertAlign w:val="subscript"/>
         </w:rPr>
-        <w:t xml:space="preserve">2</w:t>
-      </w:r>
-      <w:r>
-        <w:rPr>
-          <w:rFonts w:ascii="Times New Roman" w:cs="Times New Roman" w:eastAsia="Times New Roman" w:hAnsi="Times New Roman"/>
-          <w:b w:val="false"/>
-          <w:bCs w:val="false"/>
-          <w:i w:val="false"/>
-          <w:iCs w:val="false"/>
-          <w:sz w:val="20"/>
-          <w:szCs w:val="20"/>
-        </w:rPr>
-        <w:t xml:space="preserve">-</w:t>
-      </w:r>
-      <w:r>
-        <w:rPr>
-          <w:rFonts w:ascii="Times New Roman" w:cs="Times New Roman" w:eastAsia="Times New Roman" w:hAnsi="Times New Roman"/>
-          <w:b w:val="false"/>
-          <w:bCs w:val="false"/>
-          <w:i/>
-          <w:iCs/>
-          <w:sz w:val="20"/>
-          <w:szCs w:val="20"/>
-        </w:rPr>
-        <w:t xml:space="preserve">t</w:t>
-      </w:r>
-      <w:r>
-        <w:rPr>
-          <w:rFonts w:ascii="Times New Roman" w:cs="Times New Roman" w:eastAsia="Times New Roman" w:hAnsi="Times New Roman"/>
-          <w:b w:val="false"/>
-          <w:bCs w:val="false"/>
-          <w:i w:val="false"/>
-          <w:iCs w:val="false"/>
+        <w:t xml:space="preserve">t_1</w:t>
+      </w:r>
+      <w:r>
+        <w:rPr>
+          <w:rFonts w:ascii="Times New Roman" w:cs="Times New Roman" w:eastAsia="Times New Roman" w:hAnsi="Times New Roman"/>
+          <w:b w:val="false"/>
+          <w:bCs w:val="false"/>
+          <w:i/>
+          <w:iCs/>
+          <w:sz w:val="20"/>
+          <w:szCs w:val="20"/>
+          <w:vertAlign w:val="superscript"/>
+        </w:rPr>
+        <w:t xml:space="preserve">t_2</w:t>
+      </w:r>
+      <w:r>
+        <w:rPr>
+          <w:rFonts w:ascii="Times New Roman" w:cs="Times New Roman" w:eastAsia="Times New Roman" w:hAnsi="Times New Roman"/>
+          <w:b w:val="false"/>
+          <w:bCs w:val="false"/>
+          <w:i/>
+          <w:iCs/>
+          <w:sz w:val="20"/>
+          <w:szCs w:val="20"/>
+        </w:rPr>
+        <w:t xml:space="preserve">V</w:t>
+      </w:r>
+      <w:r>
+        <w:rPr>
+          <w:rFonts w:ascii="Times New Roman" w:cs="Times New Roman" w:eastAsia="Times New Roman" w:hAnsi="Times New Roman"/>
+          <w:b w:val="false"/>
+          <w:bCs w:val="false"/>
+          <w:i/>
+          <w:iCs/>
           <w:sz w:val="20"/>
           <w:szCs w:val="20"/>
           <w:vertAlign w:val="subscript"/>
         </w:rPr>
-        <w:t xml:space="preserve">1</w:t>
-      </w:r>
-      <w:r>
-        <w:rPr>
-          <w:rFonts w:ascii="Times New Roman" w:cs="Times New Roman" w:eastAsia="Times New Roman" w:hAnsi="Times New Roman"/>
-          <w:b w:val="false"/>
-          <w:bCs w:val="false"/>
-          <w:i w:val="false"/>
-          <w:iCs w:val="false"/>
-          <w:sz w:val="20"/>
-          <w:szCs w:val="20"/>
-        </w:rPr>
-        <w:t xml:space="preserve">\</w:t>
-      </w:r>
-      <w:r>
-        <w:rPr>
-          <w:rFonts w:ascii="Times New Roman" w:cs="Times New Roman" w:eastAsia="Times New Roman" w:hAnsi="Times New Roman"/>
-          <w:b w:val="false"/>
-          <w:bCs w:val="false"/>
-          <w:i/>
-          <w:iCs/>
-          <w:sz w:val="20"/>
-          <w:szCs w:val="20"/>
-        </w:rPr>
-        <w:t xml:space="preserve">int</w:t>
+        <w:t xml:space="preserve">DD</w:t>
+      </w:r>
+      <w:r>
+        <w:rPr>
+          <w:rFonts w:ascii="Times New Roman" w:cs="Times New Roman" w:eastAsia="Times New Roman" w:hAnsi="Times New Roman"/>
+          <w:b w:val="false"/>
+          <w:bCs w:val="false"/>
+          <w:i/>
+          <w:iCs/>
+          <w:sz w:val="20"/>
+          <w:szCs w:val="20"/>
+        </w:rPr>
+        <w:t xml:space="preserve">I</w:t>
       </w:r>
       <w:r>
         <w:rPr>
@@ -21251,44 +21037,6 @@
           <w:szCs w:val="20"/>
           <w:vertAlign w:val="subscript"/>
         </w:rPr>
-        <w:t xml:space="preserve">t_1</w:t>
-      </w:r>
-      <w:r>
-        <w:rPr>
-          <w:rFonts w:ascii="Times New Roman" w:cs="Times New Roman" w:eastAsia="Times New Roman" w:hAnsi="Times New Roman"/>
-          <w:b w:val="false"/>
-          <w:bCs w:val="false"/>
-          <w:i/>
-          <w:iCs/>
-          <w:sz w:val="20"/>
-          <w:szCs w:val="20"/>
-          <w:vertAlign w:val="superscript"/>
-        </w:rPr>
-        <w:t xml:space="preserve">t_2</w:t>
-      </w:r>
-      <w:r>
-        <w:rPr>
-          <w:rFonts w:ascii="Times New Roman" w:cs="Times New Roman" w:eastAsia="Times New Roman" w:hAnsi="Times New Roman"/>
-          <w:b w:val="false"/>
-          <w:bCs w:val="false"/>
-          <w:i/>
-          <w:iCs/>
-          <w:sz w:val="20"/>
-          <w:szCs w:val="20"/>
-        </w:rPr>
-        <w:t xml:space="preserve">V</w:t>
-      </w:r>
-      <w:r>
-        <w:rPr>
-          <w:rFonts w:ascii="Times New Roman" w:cs="Times New Roman" w:eastAsia="Times New Roman" w:hAnsi="Times New Roman"/>
-          <w:b w:val="false"/>
-          <w:bCs w:val="false"/>
-          <w:i/>
-          <w:iCs/>
-          <w:sz w:val="20"/>
-          <w:szCs w:val="20"/>
-          <w:vertAlign w:val="subscript"/>
-        </w:rPr>
         <w:t xml:space="preserve">DD</w:t>
       </w:r>
       <w:r>
@@ -21301,44 +21049,7 @@
           <w:sz w:val="20"/>
           <w:szCs w:val="20"/>
         </w:rPr>
-        <w:t xml:space="preserve">I</w:t>
-      </w:r>
-      <w:r>
-        <w:rPr>
-          <w:rFonts w:ascii="Times New Roman" w:cs="Times New Roman" w:eastAsia="Times New Roman" w:hAnsi="Times New Roman"/>
-          <w:b w:val="false"/>
-          <w:bCs w:val="false"/>
-          <w:i/>
-          <w:iCs/>
-          <w:sz w:val="20"/>
-          <w:szCs w:val="20"/>
-          <w:vertAlign w:val="subscript"/>
-        </w:rPr>
-        <w:t xml:space="preserve">DD</w:t>
-      </w:r>
-      <w:r>
-        <w:rPr>
-          <w:rFonts w:ascii="Times New Roman" w:cs="Times New Roman" w:eastAsia="Times New Roman" w:hAnsi="Times New Roman"/>
-          <w:b w:val="false"/>
-          <w:bCs w:val="false"/>
-          <w:i/>
-          <w:iCs/>
-          <w:sz w:val="20"/>
-          <w:szCs w:val="20"/>
-        </w:rPr>
-        <w:t xml:space="preserve">d</w:t>
-      </w:r>
-      <w:r>
-        <w:rPr>
-          <w:rFonts w:ascii="Times New Roman" w:cs="Times New Roman" w:eastAsia="Times New Roman" w:hAnsi="Times New Roman"/>
-          <w:b w:val="false"/>
-          <w:bCs w:val="false"/>
-          <w:i/>
-          <w:iCs/>
-          <w:sz w:val="20"/>
-          <w:szCs w:val="20"/>
-        </w:rPr>
-        <w:t xml:space="preserve">t</w:t>
+        <w:t xml:space="preserve">dt</w:t>
       </w:r>
       <w:r>
         <w:rPr>
@@ -21702,7 +21413,7 @@
           <w:sz w:val="20"/>
           <w:szCs w:val="20"/>
         </w:rPr>
-        <w:t xml:space="preserve">G. </w:t>
+        <w:t xml:space="preserve">A. </w:t>
       </w:r>
       <w:r>
         <w:rPr>
@@ -25808,38 +25519,56 @@
           <w:sz w:val="20"/>
           <w:szCs w:val="20"/>
         </w:rPr>
-        <w:t xml:space="preserve">H. </w:t>
-      </w:r>
-      <w:r>
-        <w:rPr>
-          <w:rFonts w:ascii="Times New Roman" w:cs="Times New Roman" w:eastAsia="Times New Roman" w:hAnsi="Times New Roman"/>
-          <w:b w:val="false"/>
-          <w:bCs w:val="false"/>
-          <w:i/>
-          <w:iCs/>
-          <w:sz w:val="20"/>
-          <w:szCs w:val="20"/>
-        </w:rPr>
-        <w:t xml:space="preserve">Unified $V_{DD</w:t>
-      </w:r>
-    </w:p>
-    <w:p>
-      <w:pPr>
-        <w:spacing w:after="0" w:before="0" w:line="240"/>
-        <w:ind w:firstLine="200"/>
-        <w:jc w:val="both"/>
-      </w:pPr>
-      <w:r>
-        <w:rPr>
-          <w:rFonts w:ascii="Times New Roman" w:cs="Times New Roman" w:eastAsia="Times New Roman" w:hAnsi="Times New Roman"/>
-          <w:b w:val="false"/>
-          <w:bCs w:val="false"/>
-          <w:i w:val="false"/>
-          <w:iCs w:val="false"/>
-          <w:sz w:val="20"/>
-          <w:szCs w:val="20"/>
-        </w:rPr>
-        <w:t xml:space="preserve">$ and temperature sweeps}</w:t>
+        <w:t xml:space="preserve">B. </w:t>
+      </w:r>
+      <w:r>
+        <w:rPr>
+          <w:rFonts w:ascii="Times New Roman" w:cs="Times New Roman" w:eastAsia="Times New Roman" w:hAnsi="Times New Roman"/>
+          <w:b w:val="false"/>
+          <w:bCs w:val="false"/>
+          <w:i/>
+          <w:iCs/>
+          <w:sz w:val="20"/>
+          <w:szCs w:val="20"/>
+        </w:rPr>
+        <w:t xml:space="preserve">Unified </w:t>
+      </w:r>
+      <w:r>
+        <w:rPr>
+          <w:rFonts w:ascii="Times New Roman" w:cs="Times New Roman" w:eastAsia="Times New Roman" w:hAnsi="Times New Roman"/>
+          <w:b w:val="false"/>
+          <w:bCs w:val="false"/>
+          <w:i/>
+          <w:iCs/>
+          <w:sz w:val="20"/>
+          <w:szCs w:val="20"/>
+        </w:rPr>
+        <w:t xml:space="preserve">V</w:t>
+      </w:r>
+      <w:r>
+        <w:rPr>
+          <w:rFonts w:ascii="Times New Roman" w:cs="Times New Roman" w:eastAsia="Times New Roman" w:hAnsi="Times New Roman"/>
+          <w:b w:val="false"/>
+          <w:bCs w:val="false"/>
+          <w:i/>
+          <w:iCs/>
+          <w:sz w:val="20"/>
+          <w:szCs w:val="20"/>
+          <w:vertAlign w:val="subscript"/>
+        </w:rPr>
+        <w:t xml:space="preserve">DD</w:t>
+      </w:r>
+      <w:r>
+        <w:rPr>
+          <w:rFonts w:ascii="Times New Roman" w:cs="Times New Roman" w:eastAsia="Times New Roman" w:hAnsi="Times New Roman"/>
+          <w:b w:val="false"/>
+          <w:bCs w:val="false"/>
+          <w:i/>
+          <w:iCs/>
+          <w:sz w:val="20"/>
+          <w:szCs w:val="20"/>
+        </w:rPr>
+        <w:t xml:space="preserve"> and temperature sweeps</w:t>
       </w:r>
     </w:p>
     <w:p>
@@ -27196,7 +26925,7 @@
           <w:sz w:val="20"/>
           <w:szCs w:val="20"/>
         </w:rPr>
-        <w:t xml:space="preserve">I. </w:t>
+        <w:t xml:space="preserve">C. </w:t>
       </w:r>
       <w:r>
         <w:rPr>
@@ -28142,31 +27871,7 @@
           <w:sz w:val="20"/>
           <w:szCs w:val="20"/>
         </w:rPr>
-        <w:t xml:space="preserve">2\</w:t>
-      </w:r>
-      <w:r>
-        <w:rPr>
-          <w:rFonts w:ascii="Times New Roman" w:cs="Times New Roman" w:eastAsia="Times New Roman" w:hAnsi="Times New Roman"/>
-          <w:b w:val="false"/>
-          <w:bCs w:val="false"/>
-          <w:i/>
-          <w:iCs/>
-          <w:sz w:val="20"/>
-          <w:szCs w:val="20"/>
-        </w:rPr>
-        <w:t xml:space="preserve">times</w:t>
-      </w:r>
-      <w:r>
-        <w:rPr>
-          <w:rFonts w:ascii="Times New Roman" w:cs="Times New Roman" w:eastAsia="Times New Roman" w:hAnsi="Times New Roman"/>
-          <w:b w:val="false"/>
-          <w:bCs w:val="false"/>
-          <w:i w:val="false"/>
-          <w:iCs w:val="false"/>
-          <w:sz w:val="20"/>
-          <w:szCs w:val="20"/>
-        </w:rPr>
-        <w:t xml:space="preserve">2</w:t>
+        <w:t xml:space="preserve">2×2</w:t>
       </w:r>
       <w:r>
         <w:rPr>
@@ -28190,31 +27895,7 @@
           <w:sz w:val="20"/>
           <w:szCs w:val="20"/>
         </w:rPr>
-        <w:t xml:space="preserve">5\</w:t>
-      </w:r>
-      <w:r>
-        <w:rPr>
-          <w:rFonts w:ascii="Times New Roman" w:cs="Times New Roman" w:eastAsia="Times New Roman" w:hAnsi="Times New Roman"/>
-          <w:b w:val="false"/>
-          <w:bCs w:val="false"/>
-          <w:i/>
-          <w:iCs/>
-          <w:sz w:val="20"/>
-          <w:szCs w:val="20"/>
-        </w:rPr>
-        <w:t xml:space="preserve">times</w:t>
-      </w:r>
-      <w:r>
-        <w:rPr>
-          <w:rFonts w:ascii="Times New Roman" w:cs="Times New Roman" w:eastAsia="Times New Roman" w:hAnsi="Times New Roman"/>
-          <w:b w:val="false"/>
-          <w:bCs w:val="false"/>
-          <w:i w:val="false"/>
-          <w:iCs w:val="false"/>
-          <w:sz w:val="20"/>
-          <w:szCs w:val="20"/>
-        </w:rPr>
-        <w:t xml:space="preserve">5</w:t>
+        <w:t xml:space="preserve">5×5</w:t>
       </w:r>
       <w:r>
         <w:rPr>
@@ -29825,19 +29506,93 @@
           <w:sz w:val="20"/>
           <w:szCs w:val="20"/>
         </w:rPr>
-        <w:t xml:space="preserve">5\</w:t>
-      </w:r>
-      <w:r>
-        <w:rPr>
-          <w:rFonts w:ascii="Times New Roman" w:cs="Times New Roman" w:eastAsia="Times New Roman" w:hAnsi="Times New Roman"/>
-          <w:b w:val="false"/>
-          <w:bCs w:val="false"/>
-          <w:i/>
-          <w:iCs/>
-          <w:sz w:val="20"/>
-          <w:szCs w:val="20"/>
-        </w:rPr>
-        <w:t xml:space="preserve">times</w:t>
+        <w:t xml:space="preserve">5×10</w:t>
+      </w:r>
+      <w:r>
+        <w:rPr>
+          <w:rFonts w:ascii="Times New Roman" w:cs="Times New Roman" w:eastAsia="Times New Roman" w:hAnsi="Times New Roman"/>
+          <w:b w:val="false"/>
+          <w:bCs w:val="false"/>
+          <w:i/>
+          <w:iCs/>
+          <w:sz w:val="20"/>
+          <w:szCs w:val="20"/>
+          <w:vertAlign w:val="superscript"/>
+        </w:rPr>
+        <w:t xml:space="preserve">-3</w:t>
+      </w:r>
+      <w:r>
+        <w:rPr>
+          <w:rFonts w:ascii="Times New Roman" w:cs="Times New Roman" w:eastAsia="Times New Roman" w:hAnsi="Times New Roman"/>
+          <w:b w:val="false"/>
+          <w:bCs w:val="false"/>
+          <w:i w:val="false"/>
+          <w:iCs w:val="false"/>
+          <w:sz w:val="20"/>
+          <w:szCs w:val="20"/>
+        </w:rPr>
+        <w:t xml:space="preserve"> and 5.7 </w:t>
+      </w:r>
+      <w:r>
+        <w:rPr>
+          <w:rFonts w:ascii="Times New Roman" w:cs="Times New Roman" w:eastAsia="Times New Roman" w:hAnsi="Times New Roman"/>
+          <w:b w:val="false"/>
+          <w:bCs w:val="false"/>
+          <w:i w:val="false"/>
+          <w:iCs w:val="false"/>
+          <w:sz w:val="20"/>
+          <w:szCs w:val="20"/>
+        </w:rPr>
+        <w:t xml:space="preserve">µ</w:t>
+      </w:r>
+      <w:r>
+        <w:rPr>
+          <w:rFonts w:ascii="Times New Roman" w:cs="Times New Roman" w:eastAsia="Times New Roman" w:hAnsi="Times New Roman"/>
+          <w:b w:val="false"/>
+          <w:bCs w:val="false"/>
+          <w:i w:val="false"/>
+          <w:iCs w:val="false"/>
+          <w:sz w:val="20"/>
+          <w:szCs w:val="20"/>
+        </w:rPr>
+        <w:t xml:space="preserve">W at </w:t>
+      </w:r>
+      <w:r>
+        <w:rPr>
+          <w:rFonts w:ascii="Times New Roman" w:cs="Times New Roman" w:eastAsia="Times New Roman" w:hAnsi="Times New Roman"/>
+          <w:b w:val="false"/>
+          <w:bCs w:val="false"/>
+          <w:i w:val="false"/>
+          <w:iCs w:val="false"/>
+          <w:sz w:val="20"/>
+          <w:szCs w:val="20"/>
+        </w:rPr>
+        <w:t xml:space="preserve">2×10</w:t>
+      </w:r>
+      <w:r>
+        <w:rPr>
+          <w:rFonts w:ascii="Times New Roman" w:cs="Times New Roman" w:eastAsia="Times New Roman" w:hAnsi="Times New Roman"/>
+          <w:b w:val="false"/>
+          <w:bCs w:val="false"/>
+          <w:i/>
+          <w:iCs/>
+          <w:sz w:val="20"/>
+          <w:szCs w:val="20"/>
+          <w:vertAlign w:val="superscript"/>
+        </w:rPr>
+        <w:t xml:space="preserve">-2</w:t>
+      </w:r>
+      <w:r>
+        <w:rPr>
+          <w:rFonts w:ascii="Times New Roman" w:cs="Times New Roman" w:eastAsia="Times New Roman" w:hAnsi="Times New Roman"/>
+          <w:b w:val="false"/>
+          <w:bCs w:val="false"/>
+          <w:i w:val="false"/>
+          <w:iCs w:val="false"/>
+          <w:sz w:val="20"/>
+          <w:szCs w:val="20"/>
+        </w:rPr>
+        <w:t xml:space="preserve">, while the gain falls from 22 to 18.3, 11.2 and 7.4 (</w:t>
       </w:r>
       <w:r>
         <w:rPr>
@@ -29874,55 +29629,44 @@
           <w:sz w:val="20"/>
           <w:szCs w:val="20"/>
         </w:rPr>
-        <w:t xml:space="preserve"> and 5.7 </w:t>
-      </w:r>
-      <w:r>
-        <w:rPr>
-          <w:rFonts w:ascii="Times New Roman" w:cs="Times New Roman" w:eastAsia="Times New Roman" w:hAnsi="Times New Roman"/>
-          <w:b w:val="false"/>
-          <w:bCs w:val="false"/>
-          <w:i w:val="false"/>
-          <w:iCs w:val="false"/>
-          <w:sz w:val="20"/>
-          <w:szCs w:val="20"/>
-        </w:rPr>
-        <w:t xml:space="preserve">µ</w:t>
-      </w:r>
-      <w:r>
-        <w:rPr>
-          <w:rFonts w:ascii="Times New Roman" w:cs="Times New Roman" w:eastAsia="Times New Roman" w:hAnsi="Times New Roman"/>
-          <w:b w:val="false"/>
-          <w:bCs w:val="false"/>
-          <w:i w:val="false"/>
-          <w:iCs w:val="false"/>
-          <w:sz w:val="20"/>
-          <w:szCs w:val="20"/>
-        </w:rPr>
-        <w:t xml:space="preserve">W at </w:t>
-      </w:r>
-      <w:r>
-        <w:rPr>
-          <w:rFonts w:ascii="Times New Roman" w:cs="Times New Roman" w:eastAsia="Times New Roman" w:hAnsi="Times New Roman"/>
-          <w:b w:val="false"/>
-          <w:bCs w:val="false"/>
-          <w:i w:val="false"/>
-          <w:iCs w:val="false"/>
-          <w:sz w:val="20"/>
-          <w:szCs w:val="20"/>
-        </w:rPr>
-        <w:t xml:space="preserve">2\</w:t>
-      </w:r>
-      <w:r>
-        <w:rPr>
-          <w:rFonts w:ascii="Times New Roman" w:cs="Times New Roman" w:eastAsia="Times New Roman" w:hAnsi="Times New Roman"/>
-          <w:b w:val="false"/>
-          <w:bCs w:val="false"/>
-          <w:i/>
-          <w:iCs/>
-          <w:sz w:val="20"/>
-          <w:szCs w:val="20"/>
-        </w:rPr>
-        <w:t xml:space="preserve">times</w:t>
+        <w:t xml:space="preserve">, </w:t>
+      </w:r>
+      <w:r>
+        <w:rPr>
+          <w:rFonts w:ascii="Times New Roman" w:cs="Times New Roman" w:eastAsia="Times New Roman" w:hAnsi="Times New Roman"/>
+          <w:b w:val="false"/>
+          <w:bCs w:val="false"/>
+          <w:i w:val="false"/>
+          <w:iCs w:val="false"/>
+          <w:sz w:val="20"/>
+          <w:szCs w:val="20"/>
+        </w:rPr>
+        <w:t xml:space="preserve">5×10</w:t>
+      </w:r>
+      <w:r>
+        <w:rPr>
+          <w:rFonts w:ascii="Times New Roman" w:cs="Times New Roman" w:eastAsia="Times New Roman" w:hAnsi="Times New Roman"/>
+          <w:b w:val="false"/>
+          <w:bCs w:val="false"/>
+          <w:i/>
+          <w:iCs/>
+          <w:sz w:val="20"/>
+          <w:szCs w:val="20"/>
+          <w:vertAlign w:val="superscript"/>
+        </w:rPr>
+        <w:t xml:space="preserve">-3</w:t>
+      </w:r>
+      <w:r>
+        <w:rPr>
+          <w:rFonts w:ascii="Times New Roman" w:cs="Times New Roman" w:eastAsia="Times New Roman" w:hAnsi="Times New Roman"/>
+          <w:b w:val="false"/>
+          <w:bCs w:val="false"/>
+          <w:i w:val="false"/>
+          <w:iCs w:val="false"/>
+          <w:sz w:val="20"/>
+          <w:szCs w:val="20"/>
+        </w:rPr>
+        <w:t xml:space="preserve">, </w:t>
       </w:r>
       <w:r>
         <w:rPr>
@@ -29959,19 +29703,43 @@
           <w:sz w:val="20"/>
           <w:szCs w:val="20"/>
         </w:rPr>
-        <w:t xml:space="preserve">, while the gain falls from 22 to 18.3, 11.2 and 7.4 (</w:t>
-      </w:r>
-      <w:r>
-        <w:rPr>
-          <w:rFonts w:ascii="Times New Roman" w:cs="Times New Roman" w:eastAsia="Times New Roman" w:hAnsi="Times New Roman"/>
-          <w:b w:val="false"/>
-          <w:bCs w:val="false"/>
-          <w:i w:val="false"/>
-          <w:iCs w:val="false"/>
-          <w:sz w:val="20"/>
-          <w:szCs w:val="20"/>
-        </w:rPr>
-        <w:t xml:space="preserve">10</w:t>
+        <w:t xml:space="preserve">) and the RO energy per cycle rises 1.49</w:t>
+      </w:r>
+      <w:r>
+        <w:rPr>
+          <w:rFonts w:ascii="Times New Roman" w:cs="Times New Roman" w:eastAsia="Times New Roman" w:hAnsi="Times New Roman"/>
+          <w:b w:val="false"/>
+          <w:bCs w:val="false"/>
+          <w:i w:val="false"/>
+          <w:iCs w:val="false"/>
+          <w:sz w:val="20"/>
+          <w:szCs w:val="20"/>
+        </w:rPr>
+        <w:t xml:space="preserve">×</w:t>
+      </w:r>
+      <w:r>
+        <w:rPr>
+          <w:rFonts w:ascii="Times New Roman" w:cs="Times New Roman" w:eastAsia="Times New Roman" w:hAnsi="Times New Roman"/>
+          <w:b w:val="false"/>
+          <w:bCs w:val="false"/>
+          <w:i w:val="false"/>
+          <w:iCs w:val="false"/>
+          <w:sz w:val="20"/>
+          <w:szCs w:val="20"/>
+        </w:rPr>
+        <w:t xml:space="preserve"> at </w:t>
+      </w:r>
+      <w:r>
+        <w:rPr>
+          <w:rFonts w:ascii="Times New Roman" w:cs="Times New Roman" w:eastAsia="Times New Roman" w:hAnsi="Times New Roman"/>
+          <w:b w:val="false"/>
+          <w:bCs w:val="false"/>
+          <w:i w:val="false"/>
+          <w:iCs w:val="false"/>
+          <w:sz w:val="20"/>
+          <w:szCs w:val="20"/>
+        </w:rPr>
+        <w:t xml:space="preserve">2×10</w:t>
       </w:r>
       <w:r>
         <w:rPr>
@@ -29984,104 +29752,6 @@
           <w:szCs w:val="20"/>
           <w:vertAlign w:val="superscript"/>
         </w:rPr>
-        <w:t xml:space="preserve">-3</w:t>
-      </w:r>
-      <w:r>
-        <w:rPr>
-          <w:rFonts w:ascii="Times New Roman" w:cs="Times New Roman" w:eastAsia="Times New Roman" w:hAnsi="Times New Roman"/>
-          <w:b w:val="false"/>
-          <w:bCs w:val="false"/>
-          <w:i w:val="false"/>
-          <w:iCs w:val="false"/>
-          <w:sz w:val="20"/>
-          <w:szCs w:val="20"/>
-        </w:rPr>
-        <w:t xml:space="preserve">, </w:t>
-      </w:r>
-      <w:r>
-        <w:rPr>
-          <w:rFonts w:ascii="Times New Roman" w:cs="Times New Roman" w:eastAsia="Times New Roman" w:hAnsi="Times New Roman"/>
-          <w:b w:val="false"/>
-          <w:bCs w:val="false"/>
-          <w:i w:val="false"/>
-          <w:iCs w:val="false"/>
-          <w:sz w:val="20"/>
-          <w:szCs w:val="20"/>
-        </w:rPr>
-        <w:t xml:space="preserve">5\</w:t>
-      </w:r>
-      <w:r>
-        <w:rPr>
-          <w:rFonts w:ascii="Times New Roman" w:cs="Times New Roman" w:eastAsia="Times New Roman" w:hAnsi="Times New Roman"/>
-          <w:b w:val="false"/>
-          <w:bCs w:val="false"/>
-          <w:i/>
-          <w:iCs/>
-          <w:sz w:val="20"/>
-          <w:szCs w:val="20"/>
-        </w:rPr>
-        <w:t xml:space="preserve">times</w:t>
-      </w:r>
-      <w:r>
-        <w:rPr>
-          <w:rFonts w:ascii="Times New Roman" w:cs="Times New Roman" w:eastAsia="Times New Roman" w:hAnsi="Times New Roman"/>
-          <w:b w:val="false"/>
-          <w:bCs w:val="false"/>
-          <w:i w:val="false"/>
-          <w:iCs w:val="false"/>
-          <w:sz w:val="20"/>
-          <w:szCs w:val="20"/>
-        </w:rPr>
-        <w:t xml:space="preserve">10</w:t>
-      </w:r>
-      <w:r>
-        <w:rPr>
-          <w:rFonts w:ascii="Times New Roman" w:cs="Times New Roman" w:eastAsia="Times New Roman" w:hAnsi="Times New Roman"/>
-          <w:b w:val="false"/>
-          <w:bCs w:val="false"/>
-          <w:i/>
-          <w:iCs/>
-          <w:sz w:val="20"/>
-          <w:szCs w:val="20"/>
-          <w:vertAlign w:val="superscript"/>
-        </w:rPr>
-        <w:t xml:space="preserve">-3</w:t>
-      </w:r>
-      <w:r>
-        <w:rPr>
-          <w:rFonts w:ascii="Times New Roman" w:cs="Times New Roman" w:eastAsia="Times New Roman" w:hAnsi="Times New Roman"/>
-          <w:b w:val="false"/>
-          <w:bCs w:val="false"/>
-          <w:i w:val="false"/>
-          <w:iCs w:val="false"/>
-          <w:sz w:val="20"/>
-          <w:szCs w:val="20"/>
-        </w:rPr>
-        <w:t xml:space="preserve">, </w:t>
-      </w:r>
-      <w:r>
-        <w:rPr>
-          <w:rFonts w:ascii="Times New Roman" w:cs="Times New Roman" w:eastAsia="Times New Roman" w:hAnsi="Times New Roman"/>
-          <w:b w:val="false"/>
-          <w:bCs w:val="false"/>
-          <w:i w:val="false"/>
-          <w:iCs w:val="false"/>
-          <w:sz w:val="20"/>
-          <w:szCs w:val="20"/>
-        </w:rPr>
-        <w:t xml:space="preserve">10</w:t>
-      </w:r>
-      <w:r>
-        <w:rPr>
-          <w:rFonts w:ascii="Times New Roman" w:cs="Times New Roman" w:eastAsia="Times New Roman" w:hAnsi="Times New Roman"/>
-          <w:b w:val="false"/>
-          <w:bCs w:val="false"/>
-          <w:i/>
-          <w:iCs/>
-          <w:sz w:val="20"/>
-          <w:szCs w:val="20"/>
-          <w:vertAlign w:val="superscript"/>
-        </w:rPr>
         <w:t xml:space="preserve">-2</w:t>
       </w:r>
       <w:r>
@@ -30094,91 +29764,6 @@
           <w:sz w:val="20"/>
           <w:szCs w:val="20"/>
         </w:rPr>
-        <w:t xml:space="preserve">) and the RO energy per cycle rises 1.49</w:t>
-      </w:r>
-      <w:r>
-        <w:rPr>
-          <w:rFonts w:ascii="Times New Roman" w:cs="Times New Roman" w:eastAsia="Times New Roman" w:hAnsi="Times New Roman"/>
-          <w:b w:val="false"/>
-          <w:bCs w:val="false"/>
-          <w:i w:val="false"/>
-          <w:iCs w:val="false"/>
-          <w:sz w:val="20"/>
-          <w:szCs w:val="20"/>
-        </w:rPr>
-        <w:t xml:space="preserve">×</w:t>
-      </w:r>
-      <w:r>
-        <w:rPr>
-          <w:rFonts w:ascii="Times New Roman" w:cs="Times New Roman" w:eastAsia="Times New Roman" w:hAnsi="Times New Roman"/>
-          <w:b w:val="false"/>
-          <w:bCs w:val="false"/>
-          <w:i w:val="false"/>
-          <w:iCs w:val="false"/>
-          <w:sz w:val="20"/>
-          <w:szCs w:val="20"/>
-        </w:rPr>
-        <w:t xml:space="preserve"> at </w:t>
-      </w:r>
-      <w:r>
-        <w:rPr>
-          <w:rFonts w:ascii="Times New Roman" w:cs="Times New Roman" w:eastAsia="Times New Roman" w:hAnsi="Times New Roman"/>
-          <w:b w:val="false"/>
-          <w:bCs w:val="false"/>
-          <w:i w:val="false"/>
-          <w:iCs w:val="false"/>
-          <w:sz w:val="20"/>
-          <w:szCs w:val="20"/>
-        </w:rPr>
-        <w:t xml:space="preserve">2\</w:t>
-      </w:r>
-      <w:r>
-        <w:rPr>
-          <w:rFonts w:ascii="Times New Roman" w:cs="Times New Roman" w:eastAsia="Times New Roman" w:hAnsi="Times New Roman"/>
-          <w:b w:val="false"/>
-          <w:bCs w:val="false"/>
-          <w:i/>
-          <w:iCs/>
-          <w:sz w:val="20"/>
-          <w:szCs w:val="20"/>
-        </w:rPr>
-        <w:t xml:space="preserve">times</w:t>
-      </w:r>
-      <w:r>
-        <w:rPr>
-          <w:rFonts w:ascii="Times New Roman" w:cs="Times New Roman" w:eastAsia="Times New Roman" w:hAnsi="Times New Roman"/>
-          <w:b w:val="false"/>
-          <w:bCs w:val="false"/>
-          <w:i w:val="false"/>
-          <w:iCs w:val="false"/>
-          <w:sz w:val="20"/>
-          <w:szCs w:val="20"/>
-        </w:rPr>
-        <w:t xml:space="preserve">10</w:t>
-      </w:r>
-      <w:r>
-        <w:rPr>
-          <w:rFonts w:ascii="Times New Roman" w:cs="Times New Roman" w:eastAsia="Times New Roman" w:hAnsi="Times New Roman"/>
-          <w:b w:val="false"/>
-          <w:bCs w:val="false"/>
-          <w:i/>
-          <w:iCs/>
-          <w:sz w:val="20"/>
-          <w:szCs w:val="20"/>
-          <w:vertAlign w:val="superscript"/>
-        </w:rPr>
-        <w:t xml:space="preserve">-2</w:t>
-      </w:r>
-      <w:r>
-        <w:rPr>
-          <w:rFonts w:ascii="Times New Roman" w:cs="Times New Roman" w:eastAsia="Times New Roman" w:hAnsi="Times New Roman"/>
-          <w:b w:val="false"/>
-          <w:bCs w:val="false"/>
-          <w:i w:val="false"/>
-          <w:iCs w:val="false"/>
-          <w:sz w:val="20"/>
-          <w:szCs w:val="20"/>
-        </w:rPr>
         <w:t xml:space="preserve">. With the </w:t>
       </w:r>
       <w:r>
@@ -30240,31 +29825,7 @@
           <w:sz w:val="20"/>
           <w:szCs w:val="20"/>
         </w:rPr>
-        <w:t xml:space="preserve">5\</w:t>
-      </w:r>
-      <w:r>
-        <w:rPr>
-          <w:rFonts w:ascii="Times New Roman" w:cs="Times New Roman" w:eastAsia="Times New Roman" w:hAnsi="Times New Roman"/>
-          <w:b w:val="false"/>
-          <w:bCs w:val="false"/>
-          <w:i/>
-          <w:iCs/>
-          <w:sz w:val="20"/>
-          <w:szCs w:val="20"/>
-        </w:rPr>
-        <w:t xml:space="preserve">times</w:t>
-      </w:r>
-      <w:r>
-        <w:rPr>
-          <w:rFonts w:ascii="Times New Roman" w:cs="Times New Roman" w:eastAsia="Times New Roman" w:hAnsi="Times New Roman"/>
-          <w:b w:val="false"/>
-          <w:bCs w:val="false"/>
-          <w:i w:val="false"/>
-          <w:iCs w:val="false"/>
-          <w:sz w:val="20"/>
-          <w:szCs w:val="20"/>
-        </w:rPr>
-        <w:t xml:space="preserve">10</w:t>
+        <w:t xml:space="preserve">5×10</w:t>
       </w:r>
       <w:r>
         <w:rPr>
@@ -30701,31 +30262,7 @@
           <w:sz w:val="20"/>
           <w:szCs w:val="20"/>
         </w:rPr>
-        <w:t xml:space="preserve">\</w:t>
-      </w:r>
-      <w:r>
-        <w:rPr>
-          <w:rFonts w:ascii="Times New Roman" w:cs="Times New Roman" w:eastAsia="Times New Roman" w:hAnsi="Times New Roman"/>
-          <w:b w:val="false"/>
-          <w:bCs w:val="false"/>
-          <w:i/>
-          <w:iCs/>
-          <w:sz w:val="20"/>
-          <w:szCs w:val="20"/>
-        </w:rPr>
-        <w:t xml:space="preserve">pm</w:t>
-      </w:r>
-      <w:r>
-        <w:rPr>
-          <w:rFonts w:ascii="Times New Roman" w:cs="Times New Roman" w:eastAsia="Times New Roman" w:hAnsi="Times New Roman"/>
-          <w:b w:val="false"/>
-          <w:bCs w:val="false"/>
-          <w:i w:val="false"/>
-          <w:iCs w:val="false"/>
-          <w:sz w:val="20"/>
-          <w:szCs w:val="20"/>
-        </w:rPr>
-        <w:t xml:space="preserve">15</w:t>
+        <w:t xml:space="preserve">±15</w:t>
       </w:r>
       <w:r>
         <w:rPr>
@@ -30961,7 +30498,7 @@
           <w:sz w:val="20"/>
           <w:szCs w:val="20"/>
         </w:rPr>
-        <w:t xml:space="preserve">J. </w:t>
+        <w:t xml:space="preserve">D. </w:t>
       </w:r>
       <w:r>
         <w:rPr>
@@ -31337,31 +30874,7 @@
           <w:sz w:val="16"/>
           <w:szCs w:val="16"/>
         </w:rPr>
-        <w:t xml:space="preserve">\</w:t>
-      </w:r>
-      <w:r>
-        <w:rPr>
-          <w:rFonts w:ascii="Times New Roman" w:cs="Times New Roman" w:eastAsia="Times New Roman" w:hAnsi="Times New Roman"/>
-          <w:b w:val="false"/>
-          <w:bCs w:val="false"/>
-          <w:i/>
-          <w:iCs/>
-          <w:sz w:val="16"/>
-          <w:szCs w:val="16"/>
-        </w:rPr>
-        <w:t xml:space="preserve">geq</w:t>
-      </w:r>
-      <w:r>
-        <w:rPr>
-          <w:rFonts w:ascii="Times New Roman" w:cs="Times New Roman" w:eastAsia="Times New Roman" w:hAnsi="Times New Roman"/>
-          <w:b w:val="false"/>
-          <w:bCs w:val="false"/>
-          <w:i w:val="false"/>
-          <w:iCs w:val="false"/>
-          <w:sz w:val="16"/>
-          <w:szCs w:val="16"/>
-        </w:rPr>
-        <w:t xml:space="preserve">0.9</w:t>
+        <w:t xml:space="preserve">≥0.9</w:t>
       </w:r>
       <w:r>
         <w:rPr>
@@ -31580,8 +31093,7 @@
                 <w:sz w:val="14"/>
                 <w:szCs w:val="14"/>
               </w:rPr>
-              <w:t xml:space="preserve">lrrrrrrr@{}}
-Platform</w:t>
+              <w:t xml:space="preserve">Platform</w:t>
             </w:r>
           </w:p>
         </w:tc>
@@ -31727,19 +31239,7 @@
                 <w:sz w:val="14"/>
                 <w:szCs w:val="14"/>
               </w:rPr>
-              <w:t xml:space="preserve">\</w:t>
-            </w:r>
-            <w:r>
-              <w:rPr>
-                <w:rFonts w:ascii="Times New Roman" w:cs="Times New Roman" w:eastAsia="Times New Roman" w:hAnsi="Times New Roman"/>
-                <w:b w:val="false"/>
-                <w:bCs w:val="false"/>
-                <w:i/>
-                <w:iCs/>
-                <w:sz w:val="14"/>
-                <w:szCs w:val="14"/>
-              </w:rPr>
-              <w:t xml:space="preserve">sigma</w:t>
+              <w:t xml:space="preserve">σ</w:t>
             </w:r>
             <w:r>
               <w:rPr>
@@ -34157,31 +33657,7 @@
           <w:sz w:val="20"/>
           <w:szCs w:val="20"/>
         </w:rPr>
-        <w:t xml:space="preserve">\</w:t>
-      </w:r>
-      <w:r>
-        <w:rPr>
-          <w:rFonts w:ascii="Times New Roman" w:cs="Times New Roman" w:eastAsia="Times New Roman" w:hAnsi="Times New Roman"/>
-          <w:b w:val="false"/>
-          <w:bCs w:val="false"/>
-          <w:i/>
-          <w:iCs/>
-          <w:sz w:val="20"/>
-          <w:szCs w:val="20"/>
-        </w:rPr>
-        <w:t xml:space="preserve">geq</w:t>
-      </w:r>
-      <w:r>
-        <w:rPr>
-          <w:rFonts w:ascii="Times New Roman" w:cs="Times New Roman" w:eastAsia="Times New Roman" w:hAnsi="Times New Roman"/>
-          <w:b w:val="false"/>
-          <w:bCs w:val="false"/>
-          <w:i w:val="false"/>
-          <w:iCs w:val="false"/>
-          <w:sz w:val="20"/>
-          <w:szCs w:val="20"/>
-        </w:rPr>
-        <w:t xml:space="preserve">99.9</w:t>
+        <w:t xml:space="preserve">≥99.9</w:t>
       </w:r>
       <w:r>
         <w:rPr>
@@ -34291,19 +33767,7 @@
           <w:sz w:val="20"/>
           <w:szCs w:val="20"/>
         </w:rPr>
-        <w:t xml:space="preserve">\</w:t>
-      </w:r>
-      <w:r>
-        <w:rPr>
-          <w:rFonts w:ascii="Times New Roman" w:cs="Times New Roman" w:eastAsia="Times New Roman" w:hAnsi="Times New Roman"/>
-          <w:b w:val="false"/>
-          <w:bCs w:val="false"/>
-          <w:i/>
-          <w:iCs/>
-          <w:sz w:val="20"/>
-          <w:szCs w:val="20"/>
-        </w:rPr>
-        <w:t xml:space="preserve">sigma</w:t>
+        <w:t xml:space="preserve">σ</w:t>
       </w:r>
       <w:r>
         <w:rPr>
@@ -34529,7 +33993,7 @@
           <w:sz w:val="20"/>
           <w:szCs w:val="20"/>
         </w:rPr>
-        <w:t xml:space="preserve">K. </w:t>
+        <w:t xml:space="preserve">E. </w:t>
       </w:r>
       <w:r>
         <w:rPr>
@@ -34839,31 +34303,7 @@
           <w:sz w:val="20"/>
           <w:szCs w:val="20"/>
         </w:rPr>
-        <w:t xml:space="preserve">90\</w:t>
-      </w:r>
-      <w:r>
-        <w:rPr>
-          <w:rFonts w:ascii="Times New Roman" w:cs="Times New Roman" w:eastAsia="Times New Roman" w:hAnsi="Times New Roman"/>
-          <w:b w:val="false"/>
-          <w:bCs w:val="false"/>
-          <w:i/>
-          <w:iCs/>
-          <w:sz w:val="20"/>
-          <w:szCs w:val="20"/>
-        </w:rPr>
-        <w:t xml:space="preserve">times</w:t>
-      </w:r>
-      <w:r>
-        <w:rPr>
-          <w:rFonts w:ascii="Times New Roman" w:cs="Times New Roman" w:eastAsia="Times New Roman" w:hAnsi="Times New Roman"/>
-          <w:b w:val="false"/>
-          <w:bCs w:val="false"/>
-          <w:i w:val="false"/>
-          <w:iCs w:val="false"/>
-          <w:sz w:val="20"/>
-          <w:szCs w:val="20"/>
-        </w:rPr>
-        <w:t xml:space="preserve">96</w:t>
+        <w:t xml:space="preserve">90×96</w:t>
       </w:r>
       <w:r>
         <w:rPr>
@@ -34912,31 +34352,7 @@
           <w:sz w:val="20"/>
           <w:szCs w:val="20"/>
         </w:rPr>
-        <w:t xml:space="preserve">108\</w:t>
-      </w:r>
-      <w:r>
-        <w:rPr>
-          <w:rFonts w:ascii="Times New Roman" w:cs="Times New Roman" w:eastAsia="Times New Roman" w:hAnsi="Times New Roman"/>
-          <w:b w:val="false"/>
-          <w:bCs w:val="false"/>
-          <w:i/>
-          <w:iCs/>
-          <w:sz w:val="20"/>
-          <w:szCs w:val="20"/>
-        </w:rPr>
-        <w:t xml:space="preserve">times</w:t>
-      </w:r>
-      <w:r>
-        <w:rPr>
-          <w:rFonts w:ascii="Times New Roman" w:cs="Times New Roman" w:eastAsia="Times New Roman" w:hAnsi="Times New Roman"/>
-          <w:b w:val="false"/>
-          <w:bCs w:val="false"/>
-          <w:i w:val="false"/>
-          <w:iCs w:val="false"/>
-          <w:sz w:val="20"/>
-          <w:szCs w:val="20"/>
-        </w:rPr>
-        <w:t xml:space="preserve">96</w:t>
+        <w:t xml:space="preserve">108×96</w:t>
       </w:r>
       <w:r>
         <w:rPr>
@@ -34985,31 +34401,7 @@
           <w:sz w:val="20"/>
           <w:szCs w:val="20"/>
         </w:rPr>
-        <w:t xml:space="preserve">400\</w:t>
-      </w:r>
-      <w:r>
-        <w:rPr>
-          <w:rFonts w:ascii="Times New Roman" w:cs="Times New Roman" w:eastAsia="Times New Roman" w:hAnsi="Times New Roman"/>
-          <w:b w:val="false"/>
-          <w:bCs w:val="false"/>
-          <w:i/>
-          <w:iCs/>
-          <w:sz w:val="20"/>
-          <w:szCs w:val="20"/>
-        </w:rPr>
-        <w:t xml:space="preserve">times</w:t>
-      </w:r>
-      <w:r>
-        <w:rPr>
-          <w:rFonts w:ascii="Times New Roman" w:cs="Times New Roman" w:eastAsia="Times New Roman" w:hAnsi="Times New Roman"/>
-          <w:b w:val="false"/>
-          <w:bCs w:val="false"/>
-          <w:i w:val="false"/>
-          <w:iCs w:val="false"/>
-          <w:sz w:val="20"/>
-          <w:szCs w:val="20"/>
-        </w:rPr>
-        <w:t xml:space="preserve">400</w:t>
+        <w:t xml:space="preserve">400×400</w:t>
       </w:r>
       <w:r>
         <w:rPr>
@@ -35319,19 +34711,7 @@
           <w:sz w:val="16"/>
           <w:szCs w:val="16"/>
         </w:rPr>
-        <w:t xml:space="preserve">1/\</w:t>
-      </w:r>
-      <w:r>
-        <w:rPr>
-          <w:rFonts w:ascii="Times New Roman" w:cs="Times New Roman" w:eastAsia="Times New Roman" w:hAnsi="Times New Roman"/>
-          <w:b w:val="false"/>
-          <w:bCs w:val="false"/>
-          <w:i/>
-          <w:iCs/>
-          <w:sz w:val="16"/>
-          <w:szCs w:val="16"/>
-        </w:rPr>
-        <w:t xml:space="preserve">sigma</w:t>
+        <w:t xml:space="preserve">1/σ</w:t>
       </w:r>
       <w:r>
         <w:rPr>
@@ -35387,31 +34767,7 @@
           <w:sz w:val="20"/>
           <w:szCs w:val="20"/>
         </w:rPr>
-        <w:t xml:space="preserve">5\</w:t>
-      </w:r>
-      <w:r>
-        <w:rPr>
-          <w:rFonts w:ascii="Times New Roman" w:cs="Times New Roman" w:eastAsia="Times New Roman" w:hAnsi="Times New Roman"/>
-          <w:b w:val="false"/>
-          <w:bCs w:val="false"/>
-          <w:i/>
-          <w:iCs/>
-          <w:sz w:val="20"/>
-          <w:szCs w:val="20"/>
-        </w:rPr>
-        <w:t xml:space="preserve">times</w:t>
-      </w:r>
-      <w:r>
-        <w:rPr>
-          <w:rFonts w:ascii="Times New Roman" w:cs="Times New Roman" w:eastAsia="Times New Roman" w:hAnsi="Times New Roman"/>
-          <w:b w:val="false"/>
-          <w:bCs w:val="false"/>
-          <w:i w:val="false"/>
-          <w:iCs w:val="false"/>
-          <w:sz w:val="20"/>
-          <w:szCs w:val="20"/>
-        </w:rPr>
-        <w:t xml:space="preserve">10</w:t>
+        <w:t xml:space="preserve">5×10</w:t>
       </w:r>
       <w:r>
         <w:rPr>
@@ -35572,8 +34928,7 @@
                 <w:sz w:val="14"/>
                 <w:szCs w:val="14"/>
               </w:rPr>
-              <w:t xml:space="preserve">p{0.46\columnwidth}}
-Design need</w:t>
+              <w:t xml:space="preserve">Design need</w:t>
             </w:r>
           </w:p>
         </w:tc>

</xml_diff>